<commit_message>
docs: redesign project slides and polish course submission materials
</commit_message>
<xml_diff>
--- a/docs/deliverables/Web开发技术现状报告_倪依玲.docx
+++ b/docs/deliverables/Web开发技术现状报告_倪依玲.docx
@@ -17,7 +17,7 @@
     </w:p>
     <w:p>
       <w:r>
-        <w:t>本人分工：组员 D，运营管理后台与内容模块。校订日期：2026 年 9 月 8 日。本文保留本人实践体会，技术行为按归档版本核对，后续团队整合工作不计为本人独立实现。</w:t>
+        <w:t>本人分工：组员 D，运营管理后台与内容模块。校订日期：2026 年 9 月 8 日。本文回顾本人负责阶段的实践，后续团队整合工作另按实际记录确认。</w:t>
       </w:r>
     </w:p>
     <w:p>
@@ -30,7 +30,7 @@
     </w:p>
     <w:p>
       <w:r>
-        <w:t>这门课之前，我对 Web 开发的理解就是写个网页就行。这次动手做完项目才知道前后端是分开的：前端负责页面和交互，后端负责数据和业务逻辑，两边通过 HTTP 接口通信。我们用的是标准前后端分离架构——前端 Next.js + TypeScript，后端 NestJS；我在项目里担任组员 D，主要负责运营管理后台（Admin UI）、CMS、媒体中心、联系工单与 SEO，所以下面这些技术里，我最熟的是 Next.js 前台接 API 的写法和 NestJS 的接口规范。</w:t>
+        <w:t>这门课之前，我对 Web 开发的理解主要停留在网页制作。这次动手开发后，我逐渐理解了前后端的分工：前端负责页面和交互，后端负责数据和业务逻辑，两边通过 HTTP 接口通信。我们使用 Next.js、TypeScript 和 NestJS；我作为组员 D，主要负责运营管理后台（Admin UI）、CMS、媒体中心、联系工单与 SEO，因此实践最多的是 Next.js 页面调用 API，以及按 NestJS 规范组织接口。</w:t>
       </w:r>
     </w:p>
     <w:p>
@@ -73,7 +73,7 @@
     </w:p>
     <w:p>
       <w:r>
-        <w:t>老师说的课程思政我理解就是：做技术的人得有底线意识。权限隔离是为了防止越权操作，审计日志是为了出了问题能追溯，不收集儿童信息、账号交易只面向成年人是为了合规。这些东西不是额外的负担，而是做系统本来就该考虑的。这次项目里，我在所负责的后台与内容模块中复用并配合完善权限和审计约定，也理解了注册成年人声明等全站安全要求，虽然实现得比较基础，但至少意识到了安全不是事后补的，是设计时就该有的。</w:t>
+        <w:t>我理解的课程思政，需要落实到开发者对用户和数据的责任中。权限隔离防止越权操作，审计日志为问题追溯保留依据，不收集儿童账户信息则减少不必要的隐私风险。这次项目里，我在后台与内容模块中复用并配合完善权限和审计约定，也学习了成年人声明等全站要求。具体措施需要结合业务和实际测试判断，不能仅凭界面提示就宣称系统已经安全或全面合规。</w:t>
       </w:r>
     </w:p>
     <w:p>
@@ -86,7 +86,7 @@
     </w:p>
     <w:p>
       <w:r>
-        <w:t>这门课让我从一个会写脚本的人变成了一个能交付后台与接口模块的人。代码能跑通、接口能调通、文档能写清、问题能定位、交付物能交差——我觉得这就是这门课想让我达到的水平。</w:t>
+        <w:t>这门课让我从脚本练习走向后台页面和接口模块开发。我开始学习把代码、迁移和操作说明放在同一个交付过程中检查，也认识到问题定位和团队联调仍需要继续练习。</w:t>
       </w:r>
     </w:p>
     <w:sectPr>

</xml_diff>